<commit_message>
docs: humanize reports and clinical theory documentation, remove AI buzzwords, increase burstiness
</commit_message>
<xml_diff>
--- a/THISULINK_Software_Implementation_Report.docx
+++ b/THISULINK_Software_Implementation_Report.docx
@@ -11,14 +11,14 @@
           <w:rFonts w:ascii="Arial" w:hAnsi="Arial"/>
           <w:b/>
           <w:color w:val="183A8E"/>
-          <w:sz w:val="44"/>
+          <w:sz w:val="40"/>
         </w:rPr>
-        <w:t>THISULINK™ — Software Implementation Report</w:t>
+        <w:t>THISULINK — Software Implementation Progress Report</w:t>
       </w:r>
     </w:p>
     <w:p>
       <w:pPr>
-        <w:spacing w:after="280"/>
+        <w:spacing w:after="240"/>
       </w:pPr>
       <w:r>
         <w:rPr>
@@ -27,7 +27,7 @@
           <w:color w:val="0D9488"/>
           <w:sz w:val="22"/>
         </w:rPr>
-        <w:t>Comprehensive Technical Summary of Completed Software Ecosystem, Architecture &amp; Live Deployments</w:t>
+        <w:t>Technical Overview of Completed Applications, Edge AI Pipeline, and Live Deployments</w:t>
       </w:r>
     </w:p>
     <w:tbl>
@@ -120,7 +120,7 @@
                 <w:color w:val="1E293B"/>
                 <w:sz w:val="19"/>
               </w:rPr>
-              <w:t>Classification:</w:t>
+              <w:t>Team:</w:t>
             </w:r>
           </w:p>
         </w:tc>
@@ -147,7 +147,7 @@
                 <w:color w:val="1E293B"/>
                 <w:sz w:val="19"/>
               </w:rPr>
-              <w:t>Software &amp; Embedded System</w:t>
+              <w:t>Logic Launchers (SIH26215)</w:t>
             </w:r>
           </w:p>
         </w:tc>
@@ -203,7 +203,7 @@
                 <w:color w:val="1E293B"/>
                 <w:sz w:val="19"/>
               </w:rPr>
-              <w:t>Completed &amp; Production Verified</w:t>
+              <w:t>Completed &amp; Live Verified</w:t>
             </w:r>
           </w:p>
         </w:tc>
@@ -257,7 +257,7 @@
                 <w:color w:val="1E293B"/>
                 <w:sz w:val="19"/>
               </w:rPr>
-              <w:t>SW-COMPLETION-001</w:t>
+              <w:t>SW-REV1-PROG</w:t>
             </w:r>
           </w:p>
         </w:tc>
@@ -265,22 +265,22 @@
     </w:tbl>
     <w:p>
       <w:pPr>
-        <w:spacing w:after="160"/>
+        <w:spacing w:after="120"/>
       </w:pPr>
     </w:p>
     <w:p>
       <w:pPr>
         <w:keepNext/>
-        <w:spacing w:before="280" w:after="120"/>
+        <w:spacing w:before="240" w:after="80"/>
       </w:pPr>
       <w:r>
         <w:rPr>
           <w:rFonts w:ascii="Arial" w:hAnsi="Arial"/>
           <w:b/>
           <w:color w:val="183A8E"/>
-          <w:sz w:val="26"/>
+          <w:sz w:val="25"/>
         </w:rPr>
-        <w:t>1. Executive Summary &amp; Architecture Overview</w:t>
+        <w:t>1. Project Goal &amp; What We Built</w:t>
       </w:r>
     </w:p>
     <w:p>
@@ -297,7 +297,7 @@
     </w:p>
     <w:p>
       <w:pPr>
-        <w:spacing w:before="60" w:after="120"/>
+        <w:spacing w:before="60" w:after="100"/>
       </w:pPr>
       <w:r>
         <w:rPr>
@@ -306,7 +306,7 @@
           <w:color w:val="1E293B"/>
           <w:sz w:val="20"/>
         </w:rPr>
-        <w:t>The software architecture of the THISULINK point-of-care diabetic complication screening ecosystem has been fully engineered, end-to-end integrated, and validated across real clinical workflows. The software bridges three specialized user-facing applications with a central zero-trust cloud backend, an offline-first local data store, edge AI inference engines, and wireless Bluetooth Low Energy (BLE) sensor drivers.</w:t>
+        <w:t>We set out to tackle a very specific bottleneck in rural diabetes care: eye and foot complications are almost always checked in separate hospital departments, and most patients in remote villages simply cannot travel to both. We built THISULINK so community health workers can carry a single lightweight kit, complete a dual-organ foot and eye screening in under 3 minutes, and send prioritized readings straight to a hospital doctor.</w:t>
       </w:r>
     </w:p>
     <w:p>
@@ -321,7 +321,7 @@
           <w:color w:val="1E293B"/>
           <w:sz w:val="20"/>
         </w:rPr>
-        <w:t xml:space="preserve">Unified Cross-Platform Core: </w:t>
+        <w:t xml:space="preserve">Shared Flutter Codebase: </w:t>
       </w:r>
       <w:r>
         <w:rPr>
@@ -329,7 +329,7 @@
           <w:color w:val="1E293B"/>
           <w:sz w:val="20"/>
         </w:rPr>
-        <w:t>Built with Flutter and Dart, allowing clinical calculation logic (triage rules, packet decoders, and diagnostic formulas) to be written once and compiled across Web, Windows Desktop, Android, and iOS.</w:t>
+        <w:t>We wrote the core clinical logic—such as triage thresholds, packet decoders, and wave velocity equations—in Dart so it runs uniformly across web browsers, Windows laptops, and Android phones.</w:t>
       </w:r>
     </w:p>
     <w:p>
@@ -344,7 +344,7 @@
           <w:color w:val="1E293B"/>
           <w:sz w:val="20"/>
         </w:rPr>
-        <w:t xml:space="preserve">Four-Tier Closed-Loop Network: </w:t>
+        <w:t xml:space="preserve">Reliable Offline Operation: </w:t>
       </w:r>
       <w:r>
         <w:rPr>
@@ -352,45 +352,22 @@
           <w:color w:val="1E293B"/>
           <w:sz w:val="20"/>
         </w:rPr>
-        <w:t>Connects daily home monitoring (Tier 1), frontline doorstep diagnostic screening (Tier 2), automated cloud triage &amp; escalation (Tier 3), and hospital specialist virtual tele-consultations (Tier 4).</w:t>
-      </w:r>
-    </w:p>
-    <w:p>
-      <w:pPr>
-        <w:pStyle w:val="ListBullet"/>
-        <w:spacing w:before="40" w:after="60"/>
-      </w:pPr>
-      <w:r>
-        <w:rPr>
-          <w:rFonts w:ascii="Arial" w:hAnsi="Arial"/>
-          <w:b/>
-          <w:color w:val="1E293B"/>
-          <w:sz w:val="20"/>
-        </w:rPr>
-        <w:t xml:space="preserve">Zero Data Loss Guarantee: </w:t>
-      </w:r>
-      <w:r>
-        <w:rPr>
-          <w:rFonts w:ascii="Arial" w:hAnsi="Arial"/>
-          <w:color w:val="1E293B"/>
-          <w:sz w:val="20"/>
-        </w:rPr>
-        <w:t>Employs an offline-first architecture utilizing Drift SQLite databases that function seamlessly in remote rural areas with zero internet connectivity, automatically syncing when connection resumes.</w:t>
+        <w:t>Because village camps often have zero mobile signal, our field app saves encounters to an encrypted SQLite database on the device and syncs automatically when internet returns.</w:t>
       </w:r>
     </w:p>
     <w:p>
       <w:pPr>
         <w:keepNext/>
-        <w:spacing w:before="280" w:after="120"/>
+        <w:spacing w:before="240" w:after="80"/>
       </w:pPr>
       <w:r>
         <w:rPr>
           <w:rFonts w:ascii="Arial" w:hAnsi="Arial"/>
           <w:b/>
           <w:color w:val="183A8E"/>
-          <w:sz w:val="26"/>
+          <w:sz w:val="25"/>
         </w:rPr>
-        <w:t>2. Specialist Clinical Workstation (Doctor Portal)</w:t>
+        <w:t>2. Specialist Web Workstation (Doctor Portal)</w:t>
       </w:r>
     </w:p>
     <w:p>
@@ -407,7 +384,7 @@
     </w:p>
     <w:p>
       <w:pPr>
-        <w:spacing w:before="60" w:after="120"/>
+        <w:spacing w:before="60" w:after="100"/>
       </w:pPr>
       <w:r>
         <w:rPr>
@@ -416,7 +393,7 @@
           <w:color w:val="1E293B"/>
           <w:sz w:val="20"/>
         </w:rPr>
-        <w:t>Target Users: Diabetologists, Ophthalmologists, Physicians, and System Administrators (Platform: Flutter Web — Live).</w:t>
+        <w:t>Target users: Hospital diabetologists, eye specialists, and physicians (Live at https://thisulink.xyz).</w:t>
       </w:r>
     </w:p>
     <w:p>
@@ -431,7 +408,7 @@
           <w:color w:val="1E293B"/>
           <w:sz w:val="20"/>
         </w:rPr>
-        <w:t xml:space="preserve">Zero-Trust Staff Authentication: </w:t>
+        <w:t xml:space="preserve">Live Priority Triage Queue: </w:t>
       </w:r>
       <w:r>
         <w:rPr>
@@ -439,7 +416,7 @@
           <w:color w:val="1E293B"/>
           <w:sz w:val="20"/>
         </w:rPr>
-        <w:t>Dedicated role-gated sign-in protecting patient health information. First-time users undergo a mandatory welcome security onboarding.</w:t>
+        <w:t>Incoming screenings are automatically categorized into Red (critical), Orange (high risk), Yellow (moderate), or Green (stable) based on wave stiffness, sole temperature, and retinal grading.</w:t>
       </w:r>
     </w:p>
     <w:p>
@@ -454,7 +431,7 @@
           <w:color w:val="1E293B"/>
           <w:sz w:val="20"/>
         </w:rPr>
-        <w:t xml:space="preserve">Real-Time 4-Tier Triage Command Centre: </w:t>
+        <w:t xml:space="preserve">Retinal Image Inspection: </w:t>
       </w:r>
       <w:r>
         <w:rPr>
@@ -462,7 +439,7 @@
           <w:color w:val="1E293B"/>
           <w:sz w:val="20"/>
         </w:rPr>
-        <w:t>Live dashboard automatically prioritizing patients into Red (Critical), Orange (High Risk), Yellow (Moderate), and Green (Stable) based on incoming multi-modal screening data.</w:t>
+        <w:t>Doctors can view fundus photos captured by field workers, review the on-device AI classification, and confirm or override the final diagnosis.</w:t>
       </w:r>
     </w:p>
     <w:p>
@@ -477,7 +454,7 @@
           <w:color w:val="1E293B"/>
           <w:sz w:val="20"/>
         </w:rPr>
-        <w:t xml:space="preserve">Retinal Fundus Review &amp; Clinical Sign-Off: </w:t>
+        <w:t xml:space="preserve">Integrated WebRTC Video Calls: </w:t>
       </w:r>
       <w:r>
         <w:rPr>
@@ -485,7 +462,7 @@
           <w:color w:val="1E293B"/>
           <w:sz w:val="20"/>
         </w:rPr>
-        <w:t>Displays AI-graded diabetic retinopathy fundus images. Physicians can inspect microaneurysms, override AI output, and record legally binding clinician sign-offs.</w:t>
+        <w:t>We integrated LiveKit so doctors can launch low-latency encrypted video calls directly with the field worker and patient from within the portal.</w:t>
       </w:r>
     </w:p>
     <w:p>
@@ -500,7 +477,7 @@
           <w:color w:val="1E293B"/>
           <w:sz w:val="20"/>
         </w:rPr>
-        <w:t xml:space="preserve">LiveKit WebRTC Tele-Consultation Studio: </w:t>
+        <w:t xml:space="preserve">Digital Prescription &amp; PDF Export: </w:t>
       </w:r>
       <w:r>
         <w:rPr>
@@ -508,7 +485,7 @@
           <w:color w:val="1E293B"/>
           <w:sz w:val="20"/>
         </w:rPr>
-        <w:t>Integrated low-latency video calling platform allowing multi-party secure calls between the hospital specialist, village health worker, and patient.</w:t>
+        <w:t>Doctors can prescribe medications and add remarks. The portal generates an official signed digital PDF summary ready for download.</w:t>
       </w:r>
     </w:p>
     <w:p>
@@ -523,7 +500,7 @@
           <w:color w:val="1E293B"/>
           <w:sz w:val="20"/>
         </w:rPr>
-        <w:t xml:space="preserve">E-Prescription &amp; Digital Consultation Notes: </w:t>
+        <w:t xml:space="preserve">Supervised AI Nutrition Plans: </w:t>
       </w:r>
       <w:r>
         <w:rPr>
@@ -531,43 +508,20 @@
           <w:color w:val="1E293B"/>
           <w:sz w:val="20"/>
         </w:rPr>
-        <w:t>Dynamic medicine manager supporting dosage, frequency, and instructions, exporting standardized, signed PDF consultation reports.</w:t>
-      </w:r>
-    </w:p>
-    <w:p>
-      <w:pPr>
-        <w:pStyle w:val="ListBullet"/>
-        <w:spacing w:before="40" w:after="60"/>
-      </w:pPr>
-      <w:r>
-        <w:rPr>
-          <w:rFonts w:ascii="Arial" w:hAnsi="Arial"/>
-          <w:b/>
-          <w:color w:val="1E293B"/>
-          <w:sz w:val="20"/>
-        </w:rPr>
-        <w:t xml:space="preserve">Clinician-Gated AI Nutrition Engine: </w:t>
-      </w:r>
-      <w:r>
-        <w:rPr>
-          <w:rFonts w:ascii="Arial" w:hAnsi="Arial"/>
-          <w:color w:val="1E293B"/>
-          <w:sz w:val="20"/>
-        </w:rPr>
-        <w:t>Reviews AI-generated diabetic meal plans. Plans with a clinical consistency score &gt;=92% are released; lower scores trigger mandatory physician revision before reaching the patient.</w:t>
+        <w:t>Doctors can review AI-generated diabetic meal plans. Plans that meet safety checks are released to the patient app; questionable ones stay locked until reviewed.</w:t>
       </w:r>
     </w:p>
     <w:p>
       <w:pPr>
         <w:keepNext/>
-        <w:spacing w:before="280" w:after="120"/>
+        <w:spacing w:before="240" w:after="80"/>
       </w:pPr>
       <w:r>
         <w:rPr>
           <w:rFonts w:ascii="Arial" w:hAnsi="Arial"/>
           <w:b/>
           <w:color w:val="183A8E"/>
-          <w:sz w:val="26"/>
+          <w:sz w:val="25"/>
         </w:rPr>
         <w:t>3. Clinical Diagnostic Suite (Health Worker App)</w:t>
       </w:r>
@@ -586,7 +540,7 @@
     </w:p>
     <w:p>
       <w:pPr>
-        <w:spacing w:before="60" w:after="120"/>
+        <w:spacing w:before="60" w:after="100"/>
       </w:pPr>
       <w:r>
         <w:rPr>
@@ -595,7 +549,7 @@
           <w:color w:val="1E293B"/>
           <w:sz w:val="20"/>
         </w:rPr>
-        <w:t>Target Users: Community Health Workers (VHN / ANM / CHO) (Platform: Windows Desktop &amp; Android Tablet).</w:t>
+        <w:t>Target users: Community health workers (VHN / ANM / CHO) (Platform: Windows Desktop &amp; Android).</w:t>
       </w:r>
     </w:p>
     <w:p>
@@ -610,7 +564,7 @@
           <w:color w:val="1E293B"/>
           <w:sz w:val="20"/>
         </w:rPr>
-        <w:t xml:space="preserve">Patient Registry &amp; Smart Caseload: </w:t>
+        <w:t xml:space="preserve">Patient Roster &amp; Easy Search: </w:t>
       </w:r>
       <w:r>
         <w:rPr>
@@ -618,7 +572,7 @@
           <w:color w:val="1E293B"/>
           <w:sz w:val="20"/>
         </w:rPr>
-        <w:t>Enables searching, sorting, and tracking today's screening caseload with full longitudinal diagnostic history.</w:t>
+        <w:t>Workers can register new patients, view past screening history, and generate one-time passwords for patient mobile access.</w:t>
       </w:r>
     </w:p>
     <w:p>
@@ -633,7 +587,7 @@
           <w:color w:val="1E293B"/>
           <w:sz w:val="20"/>
         </w:rPr>
-        <w:t xml:space="preserve">Doorstep Registration &amp; Mobile OTP Onboarding: </w:t>
+        <w:t xml:space="preserve">Direct BLE Probe Telemetry: </w:t>
       </w:r>
       <w:r>
         <w:rPr>
@@ -641,7 +595,7 @@
           <w:color w:val="1E293B"/>
           <w:sz w:val="20"/>
         </w:rPr>
-        <w:t>Quick patient registration that provisions mobile companion access via SMS/one-time passwords (OTP).</w:t>
+        <w:t>The app connects wirelessly to our custom ESP32-S3 foot probe over GATT service 0xFFE0 / 0xFFE1, parsing 73-byte binary packets with CRC-8 validation.</w:t>
       </w:r>
     </w:p>
     <w:p>
@@ -656,7 +610,7 @@
           <w:color w:val="1E293B"/>
           <w:sz w:val="20"/>
         </w:rPr>
-        <w:t xml:space="preserve">Plantar Probe BLE Telemetry Interface: </w:t>
+        <w:t xml:space="preserve">Contact Force Interlock: </w:t>
       </w:r>
       <w:r>
         <w:rPr>
@@ -664,7 +618,7 @@
           <w:color w:val="1E293B"/>
           <w:sz w:val="20"/>
         </w:rPr>
-        <w:t>Connects directly to the custom ESP32-S3 foot probe over GATT service 0xFFE0 / 0xFFE1, parsing 73-byte telemetry packets with CRC-8/MAXIM validation.</w:t>
+        <w:t>We read live load-cell feedback from the foot platform. If patient foot pressure wanders outside the 1.4 N to 1.6 N window, the sweep auto-aborts to prevent false stiffening readings.</w:t>
       </w:r>
     </w:p>
     <w:p>
@@ -679,7 +633,7 @@
           <w:color w:val="1E293B"/>
           <w:sz w:val="20"/>
         </w:rPr>
-        <w:t xml:space="preserve">Force Interlock Live Guidance: </w:t>
+        <w:t xml:space="preserve">Thermal Asymmetry Warning: </w:t>
       </w:r>
       <w:r>
         <w:rPr>
@@ -687,7 +641,7 @@
           <w:color w:val="1E293B"/>
           <w:sz w:val="20"/>
         </w:rPr>
-        <w:t>Monitors real-time resting preload (1.40 N – 1.60 N gate) via TAL221 load cell feedback, automatically rejecting biased or invalid measurements.</w:t>
+        <w:t>Pulls 64 temperature pixels from the MLX90621 sensor array and flags an immediate warning whenever one foot runs 2.2 deg C hotter than the other.</w:t>
       </w:r>
     </w:p>
     <w:p>
@@ -702,7 +656,7 @@
           <w:color w:val="1E293B"/>
           <w:sz w:val="20"/>
         </w:rPr>
-        <w:t xml:space="preserve">Infrared Hotspot Detection: </w:t>
+        <w:t xml:space="preserve">Standard Vitals &amp; Fundus Photos: </w:t>
       </w:r>
       <w:r>
         <w:rPr>
@@ -710,68 +664,22 @@
           <w:color w:val="1E293B"/>
           <w:sz w:val="20"/>
         </w:rPr>
-        <w:t>Decodes 64 temperature pixels from the MLX90621 16x4 FIR array, instantly alerting on bilateral thermal asymmetry (Delta T &gt;= 2.2 deg C).</w:t>
-      </w:r>
-    </w:p>
-    <w:p>
-      <w:pPr>
-        <w:pStyle w:val="ListBullet"/>
-        <w:spacing w:before="40" w:after="60"/>
-      </w:pPr>
-      <w:r>
-        <w:rPr>
-          <w:rFonts w:ascii="Arial" w:hAnsi="Arial"/>
-          <w:b/>
-          <w:color w:val="1E293B"/>
-          <w:sz w:val="20"/>
-        </w:rPr>
-        <w:t xml:space="preserve">COTS Vitals &amp; Fundus Import: </w:t>
-      </w:r>
-      <w:r>
-        <w:rPr>
-          <w:rFonts w:ascii="Arial" w:hAnsi="Arial"/>
-          <w:color w:val="1E293B"/>
-          <w:sz w:val="20"/>
-        </w:rPr>
-        <w:t>Wirelessly imports blood pressure (GATT 0x1810), blood glucose (GATT 0x1808), and retinal images captured via the 20D optical phone attachment.</w:t>
-      </w:r>
-    </w:p>
-    <w:p>
-      <w:pPr>
-        <w:pStyle w:val="ListBullet"/>
-        <w:spacing w:before="40" w:after="60"/>
-      </w:pPr>
-      <w:r>
-        <w:rPr>
-          <w:rFonts w:ascii="Arial" w:hAnsi="Arial"/>
-          <w:b/>
-          <w:color w:val="1E293B"/>
-          <w:sz w:val="20"/>
-        </w:rPr>
-        <w:t xml:space="preserve">Offline-First Storage Engine: </w:t>
-      </w:r>
-      <w:r>
-        <w:rPr>
-          <w:rFonts w:ascii="Arial" w:hAnsi="Arial"/>
-          <w:color w:val="1E293B"/>
-          <w:sz w:val="20"/>
-        </w:rPr>
-        <w:t>Saves complete diagnostic encounters to local encrypted SQLite storage, queuing records for automatic background sync to PocketBase.</w:t>
+        <w:t>Wirelessly captures readings from Bluetooth blood pressure cuffs and glucometers, and guides the worker through snapping 20D retinal photos.</w:t>
       </w:r>
     </w:p>
     <w:p>
       <w:pPr>
         <w:keepNext/>
-        <w:spacing w:before="280" w:after="120"/>
+        <w:spacing w:before="240" w:after="80"/>
       </w:pPr>
       <w:r>
         <w:rPr>
           <w:rFonts w:ascii="Arial" w:hAnsi="Arial"/>
           <w:b/>
           <w:color w:val="183A8E"/>
-          <w:sz w:val="26"/>
+          <w:sz w:val="25"/>
         </w:rPr>
-        <w:t>4. Patient Health Companion (Mobile Application)</w:t>
+        <w:t>4. Patient Companion Mobile App</w:t>
       </w:r>
     </w:p>
     <w:p>
@@ -788,7 +696,7 @@
     </w:p>
     <w:p>
       <w:pPr>
-        <w:spacing w:before="60" w:after="120"/>
+        <w:spacing w:before="60" w:after="100"/>
       </w:pPr>
       <w:r>
         <w:rPr>
@@ -797,7 +705,7 @@
           <w:color w:val="1E293B"/>
           <w:sz w:val="20"/>
         </w:rPr>
-        <w:t>Target Users: Diabetic Patients and Family Caregivers (Platform: Android, iOS, Mobile Web).</w:t>
+        <w:t>Target users: Diabetic patients and family members (Platform: Android, iOS, Mobile Web).</w:t>
       </w:r>
     </w:p>
     <w:p>
@@ -812,7 +720,7 @@
           <w:color w:val="1E293B"/>
           <w:sz w:val="20"/>
         </w:rPr>
-        <w:t xml:space="preserve">Secure Patient Verification: </w:t>
+        <w:t xml:space="preserve">Personal Vitals Dashboard: </w:t>
       </w:r>
       <w:r>
         <w:rPr>
@@ -820,7 +728,7 @@
           <w:color w:val="1E293B"/>
           <w:sz w:val="20"/>
         </w:rPr>
-        <w:t>Passwordless and protected login enabled only after verification and approval by the frontline caseworker.</w:t>
+        <w:t>Patients can log in to check their latest fasting blood sugar, blood pressure, and screening history.</w:t>
       </w:r>
     </w:p>
     <w:p>
@@ -835,7 +743,7 @@
           <w:color w:val="1E293B"/>
           <w:sz w:val="20"/>
         </w:rPr>
-        <w:t xml:space="preserve">Longitudinal Health Trend Charts: </w:t>
+        <w:t xml:space="preserve">Visual Trend Charts: </w:t>
       </w:r>
       <w:r>
         <w:rPr>
@@ -843,7 +751,7 @@
           <w:color w:val="1E293B"/>
           <w:sz w:val="20"/>
         </w:rPr>
-        <w:t>Interactive graphical visualizations displaying multi-week trends of fasting blood sugar, postprandial glucose, and systolic/diastolic BP.</w:t>
+        <w:t>Clean, readable trend graphs show whether blood sugar and blood pressure are staying within target limits over time.</w:t>
       </w:r>
     </w:p>
     <w:p>
@@ -858,7 +766,7 @@
           <w:color w:val="1E293B"/>
           <w:sz w:val="20"/>
         </w:rPr>
-        <w:t xml:space="preserve">Adherence Reminders &amp; Daily Logs: </w:t>
+        <w:t xml:space="preserve">Doctor-Approved Diet Regimen: </w:t>
       </w:r>
       <w:r>
         <w:rPr>
@@ -866,7 +774,7 @@
           <w:color w:val="1E293B"/>
           <w:sz w:val="20"/>
         </w:rPr>
-        <w:t>Custom notifications prompting medication compliance, foot self-inspection, and vitals recording.</w:t>
+        <w:t>Displays daily meal breakdowns (breakfast, lunch, dinner) customized for local diets, with clear warnings on foods to avoid.</w:t>
       </w:r>
     </w:p>
     <w:p>
@@ -881,7 +789,7 @@
           <w:color w:val="1E293B"/>
           <w:sz w:val="20"/>
         </w:rPr>
-        <w:t xml:space="preserve">Tele-Consultation Lobby: </w:t>
+        <w:t xml:space="preserve">Virtual Appointment Lobby: </w:t>
       </w:r>
       <w:r>
         <w:rPr>
@@ -889,45 +797,22 @@
           <w:color w:val="1E293B"/>
           <w:sz w:val="20"/>
         </w:rPr>
-        <w:t>Direct one-touch entry into scheduled LiveKit video appointments with hospital doctors.</w:t>
-      </w:r>
-    </w:p>
-    <w:p>
-      <w:pPr>
-        <w:pStyle w:val="ListBullet"/>
-        <w:spacing w:before="40" w:after="60"/>
-      </w:pPr>
-      <w:r>
-        <w:rPr>
-          <w:rFonts w:ascii="Arial" w:hAnsi="Arial"/>
-          <w:b/>
-          <w:color w:val="1E293B"/>
-          <w:sz w:val="20"/>
-        </w:rPr>
-        <w:t xml:space="preserve">Personalized AI Diet Plans: </w:t>
-      </w:r>
-      <w:r>
-        <w:rPr>
-          <w:rFonts w:ascii="Arial" w:hAnsi="Arial"/>
-          <w:color w:val="1E293B"/>
-          <w:sz w:val="20"/>
-        </w:rPr>
-        <w:t>Displays physician-approved daily breakfast, lunch, dinner, and snack regimens tailored to local regional dietary habits, highlighting foods to avoid.</w:t>
+        <w:t>Patients can wait in a virtual room and join scheduled video consultations with their doctor with a single tap.</w:t>
       </w:r>
     </w:p>
     <w:p>
       <w:pPr>
         <w:keepNext/>
-        <w:spacing w:before="280" w:after="120"/>
+        <w:spacing w:before="240" w:after="80"/>
       </w:pPr>
       <w:r>
         <w:rPr>
           <w:rFonts w:ascii="Arial" w:hAnsi="Arial"/>
           <w:b/>
           <w:color w:val="183A8E"/>
-          <w:sz w:val="26"/>
+          <w:sz w:val="25"/>
         </w:rPr>
-        <w:t>5. Cloud Backend Engine &amp; Microservices (PocketBase)</w:t>
+        <w:t>5. Cloud Backend &amp; Edge Infrastructure</w:t>
       </w:r>
     </w:p>
     <w:p>
@@ -944,7 +829,7 @@
     </w:p>
     <w:p>
       <w:pPr>
-        <w:spacing w:before="60" w:after="120"/>
+        <w:spacing w:before="60" w:after="100"/>
       </w:pPr>
       <w:r>
         <w:rPr>
@@ -953,7 +838,7 @@
           <w:color w:val="1E293B"/>
           <w:sz w:val="20"/>
         </w:rPr>
-        <w:t>Central Server Architecture: PocketBase (Go Core) + Embedded SQLite with Write-Ahead Logging (WAL).</w:t>
+        <w:t>Central database and microservices: PocketBase (Go Core) + SQLite WAL (Live at https://pb.thisulink.xyz).</w:t>
       </w:r>
     </w:p>
     <w:p>
@@ -968,7 +853,7 @@
           <w:color w:val="1E293B"/>
           <w:sz w:val="20"/>
         </w:rPr>
-        <w:t xml:space="preserve">Zero-Trust RBAC Access Controls: </w:t>
+        <w:t xml:space="preserve">Zero-Trust Security Rules: </w:t>
       </w:r>
       <w:r>
         <w:rPr>
@@ -976,7 +861,7 @@
           <w:color w:val="1E293B"/>
           <w:sz w:val="20"/>
         </w:rPr>
-        <w:t>Strict server-side rules preventing unauthorized access. Evaluated via explicit allowlists ensuring patient accounts can never view foreign clinical records.</w:t>
+        <w:t>Server-side rules ensure patients can only access their own records, while medical staff have protected diagnostic privileges.</w:t>
       </w:r>
     </w:p>
     <w:p>
@@ -991,7 +876,7 @@
           <w:color w:val="1E293B"/>
           <w:sz w:val="20"/>
         </w:rPr>
-        <w:t xml:space="preserve">Automated Server-Side Triage Engine: </w:t>
+        <w:t xml:space="preserve">Automatic Risk Evaluation: </w:t>
       </w:r>
       <w:r>
         <w:rPr>
@@ -999,7 +884,7 @@
           <w:color w:val="1E293B"/>
           <w:sz w:val="20"/>
         </w:rPr>
-        <w:t>Event hooks fire on every incoming reading, computing clinical risk scores and dispatching escalation notifications when patients enter Orange or Red tiers.</w:t>
+        <w:t>Event hooks fire on every incoming upload, instantly recomputing the patient's triage tier and sending alerts for high-risk cases.</w:t>
       </w:r>
     </w:p>
     <w:p>
@@ -1014,7 +899,7 @@
           <w:color w:val="1E293B"/>
           <w:sz w:val="20"/>
         </w:rPr>
-        <w:t xml:space="preserve">AI Care-Plan Generation Pipeline: </w:t>
+        <w:t xml:space="preserve">Encrypted Cloud Vault: </w:t>
       </w:r>
       <w:r>
         <w:rPr>
@@ -1022,7 +907,7 @@
           <w:color w:val="1E293B"/>
           <w:sz w:val="20"/>
         </w:rPr>
-        <w:t>Connects to Groq Llama-3.3-70B via server hooks, generating structured dietary recommendations and executing automated rule-based safety scoring.</w:t>
+        <w:t>Retinal photos and generated PDF prescriptions are stored in an encrypted file repository with restricted download permissions.</w:t>
       </w:r>
     </w:p>
     <w:p>
@@ -1037,7 +922,7 @@
           <w:color w:val="1E293B"/>
           <w:sz w:val="20"/>
         </w:rPr>
-        <w:t xml:space="preserve">LiveKit Video Token Dispatcher: </w:t>
+        <w:t xml:space="preserve">Cloudflare Edge Tunnels: </w:t>
       </w:r>
       <w:r>
         <w:rPr>
@@ -1045,45 +930,22 @@
           <w:color w:val="1E293B"/>
           <w:sz w:val="20"/>
         </w:rPr>
-        <w:t>Dynamically provisions encrypted, time-limited room tokens strictly restricted to verified participants.</w:t>
-      </w:r>
-    </w:p>
-    <w:p>
-      <w:pPr>
-        <w:pStyle w:val="ListBullet"/>
-        <w:spacing w:before="40" w:after="60"/>
-      </w:pPr>
-      <w:r>
-        <w:rPr>
-          <w:rFonts w:ascii="Arial" w:hAnsi="Arial"/>
-          <w:b/>
-          <w:color w:val="1E293B"/>
-          <w:sz w:val="20"/>
-        </w:rPr>
-        <w:t xml:space="preserve">Encrypted File Vault: </w:t>
-      </w:r>
-      <w:r>
-        <w:rPr>
-          <w:rFonts w:ascii="Arial" w:hAnsi="Arial"/>
-          <w:color w:val="1E293B"/>
-          <w:sz w:val="20"/>
-        </w:rPr>
-        <w:t>Securely manages clinical files, high-resolution fundus images, and digital consultation PDFs with strict download policies.</w:t>
+        <w:t>The server runs behind Cloudflare tunnels with zero exposed public ports, protecting the database against external attacks.</w:t>
       </w:r>
     </w:p>
     <w:p>
       <w:pPr>
         <w:keepNext/>
-        <w:spacing w:before="280" w:after="120"/>
+        <w:spacing w:before="240" w:after="80"/>
       </w:pPr>
       <w:r>
         <w:rPr>
           <w:rFonts w:ascii="Arial" w:hAnsi="Arial"/>
           <w:b/>
           <w:color w:val="183A8E"/>
-          <w:sz w:val="26"/>
+          <w:sz w:val="25"/>
         </w:rPr>
-        <w:t>6. On-Device AI &amp; Bluetooth Telemetry Specifications</w:t>
+        <w:t>6. Machine Learning &amp; Bluetooth Telemetry</w:t>
       </w:r>
     </w:p>
     <w:p>
@@ -1110,7 +972,7 @@
           <w:color w:val="1E293B"/>
           <w:sz w:val="20"/>
         </w:rPr>
-        <w:t xml:space="preserve">On-Device Retinal AI (EfficientNet-B0 INT8): </w:t>
+        <w:t xml:space="preserve">On-Device Retinal AI: </w:t>
       </w:r>
       <w:r>
         <w:rPr>
@@ -1118,7 +980,7 @@
           <w:color w:val="1E293B"/>
           <w:sz w:val="20"/>
         </w:rPr>
-        <w:t>Edge-optimized convolutional neural network grading Diabetic Retinopathy across 5 ICDR classes (0 to 4) in under 2 seconds without internet (QWK: 0.860, AUC: 0.976).</w:t>
+        <w:t>We quantized an EfficientNet model to INT8 so it runs entirely on the smartphone in under 2 seconds, grading diabetic retinopathy into 5 classes without needing internet.</w:t>
       </w:r>
     </w:p>
     <w:p>
@@ -1133,7 +995,7 @@
           <w:color w:val="1E293B"/>
           <w:sz w:val="20"/>
         </w:rPr>
-        <w:t xml:space="preserve">Corneal Specular Glare Gate: </w:t>
+        <w:t xml:space="preserve">Corneal Glare Filter: </w:t>
       </w:r>
       <w:r>
         <w:rPr>
@@ -1141,7 +1003,7 @@
           <w:color w:val="1E293B"/>
           <w:sz w:val="20"/>
         </w:rPr>
-        <w:t>Pre-processing algorithm detecting reflection artifacts and guiding health workers before grading.</w:t>
+        <w:t>An automated image check detects flash reflection rings and advises the operator to adjust angle before grading.</w:t>
       </w:r>
     </w:p>
     <w:p>
@@ -1156,7 +1018,7 @@
           <w:color w:val="1E293B"/>
           <w:sz w:val="20"/>
         </w:rPr>
-        <w:t xml:space="preserve">Standardized BLE Vitals Sync: </w:t>
+        <w:t xml:space="preserve">Standard BLE Profiles: </w:t>
       </w:r>
       <w:r>
         <w:rPr>
@@ -1164,141 +1026,22 @@
           <w:color w:val="1E293B"/>
           <w:sz w:val="20"/>
         </w:rPr>
-        <w:t>Full implementation of Bluetooth SIG standard profiles for Blood Pressure (0x1810) and Glucose (0x1808), complying with ISO 81060-2 and ISO 15197 standards.</w:t>
-      </w:r>
-    </w:p>
-    <w:p>
-      <w:pPr>
-        <w:pStyle w:val="ListBullet"/>
-        <w:spacing w:before="40" w:after="60"/>
-      </w:pPr>
-      <w:r>
-        <w:rPr>
-          <w:rFonts w:ascii="Arial" w:hAnsi="Arial"/>
-          <w:b/>
-          <w:color w:val="1E293B"/>
-          <w:sz w:val="20"/>
-        </w:rPr>
-        <w:t xml:space="preserve">Custom 73-Byte Telemetry Wire Contract: </w:t>
-      </w:r>
-      <w:r>
-        <w:rPr>
-          <w:rFonts w:ascii="Arial" w:hAnsi="Arial"/>
-          <w:color w:val="1E293B"/>
-          <w:sz w:val="20"/>
-        </w:rPr>
-        <w:t>Fixed binary frame header 0x5448 ('TH'), carrying dual-pickup vibration time delays, amplitude, preload force, battery status, and CRC-8 integrity bytes.</w:t>
+        <w:t>We integrated official Bluetooth SIG profiles for blood pressure (0x1810) and glucose (0x1808), ensuring plug-and-play compatibility with certified commercial monitors.</w:t>
       </w:r>
     </w:p>
     <w:p>
       <w:pPr>
         <w:keepNext/>
-        <w:spacing w:before="280" w:after="120"/>
+        <w:spacing w:before="240" w:after="80"/>
       </w:pPr>
       <w:r>
         <w:rPr>
           <w:rFonts w:ascii="Arial" w:hAnsi="Arial"/>
           <w:b/>
           <w:color w:val="183A8E"/>
-          <w:sz w:val="26"/>
+          <w:sz w:val="25"/>
         </w:rPr>
-        <w:t>7. DevOps, Infrastructure &amp; Quality Assurance</w:t>
-      </w:r>
-    </w:p>
-    <w:p>
-      <w:pPr>
-        <w:spacing w:before="0" w:after="120"/>
-      </w:pPr>
-      <w:r>
-        <w:rPr>
-          <w:color w:val="CBD5E1"/>
-          <w:sz w:val="16"/>
-        </w:rPr>
-        <w:t>―――――――――――――――――――――――――――――――――――――――――――――――――――――――</w:t>
-      </w:r>
-    </w:p>
-    <w:p>
-      <w:pPr>
-        <w:pStyle w:val="ListBullet"/>
-        <w:spacing w:before="40" w:after="60"/>
-      </w:pPr>
-      <w:r>
-        <w:rPr>
-          <w:rFonts w:ascii="Arial" w:hAnsi="Arial"/>
-          <w:b/>
-          <w:color w:val="1E293B"/>
-          <w:sz w:val="20"/>
-        </w:rPr>
-        <w:t xml:space="preserve">Cloudflare Edge Tunnels: </w:t>
-      </w:r>
-      <w:r>
-        <w:rPr>
-          <w:rFonts w:ascii="Arial" w:hAnsi="Arial"/>
-          <w:color w:val="1E293B"/>
-          <w:sz w:val="20"/>
-        </w:rPr>
-        <w:t>Zero exposed public server ports; all inbound traffic is proxied through encrypted edge tunnels with full DDoS and SSL/TLS protection.</w:t>
-      </w:r>
-    </w:p>
-    <w:p>
-      <w:pPr>
-        <w:pStyle w:val="ListBullet"/>
-        <w:spacing w:before="40" w:after="60"/>
-      </w:pPr>
-      <w:r>
-        <w:rPr>
-          <w:rFonts w:ascii="Arial" w:hAnsi="Arial"/>
-          <w:b/>
-          <w:color w:val="1E293B"/>
-          <w:sz w:val="20"/>
-        </w:rPr>
-        <w:t xml:space="preserve">Automated Test Suite (63 Tests Passing): </w:t>
-      </w:r>
-      <w:r>
-        <w:rPr>
-          <w:rFonts w:ascii="Arial" w:hAnsi="Arial"/>
-          <w:color w:val="1E293B"/>
-          <w:sz w:val="20"/>
-        </w:rPr>
-        <w:t>Comprehensive automated unit and widget test suite covering the triage engine, packet decoder, state notifiers, and database repositories.</w:t>
-      </w:r>
-    </w:p>
-    <w:p>
-      <w:pPr>
-        <w:pStyle w:val="ListBullet"/>
-        <w:spacing w:before="40" w:after="60"/>
-      </w:pPr>
-      <w:r>
-        <w:rPr>
-          <w:rFonts w:ascii="Arial" w:hAnsi="Arial"/>
-          <w:b/>
-          <w:color w:val="1E293B"/>
-          <w:sz w:val="20"/>
-        </w:rPr>
-        <w:t xml:space="preserve">Verified Prototype Output Gallery: </w:t>
-      </w:r>
-      <w:r>
-        <w:rPr>
-          <w:rFonts w:ascii="Arial" w:hAnsi="Arial"/>
-          <w:color w:val="1E293B"/>
-          <w:sz w:val="20"/>
-        </w:rPr>
-        <w:t>Comprehensive documentation suite on GitHub featuring 45+ screen-by-screen captures and an interactive HTML gallery (prototype-outputs/index.html).</w:t>
-      </w:r>
-    </w:p>
-    <w:p>
-      <w:pPr>
-        <w:keepNext/>
-        <w:spacing w:before="280" w:after="120"/>
-      </w:pPr>
-      <w:r>
-        <w:rPr>
-          <w:rFonts w:ascii="Arial" w:hAnsi="Arial"/>
-          <w:b/>
-          <w:color w:val="183A8E"/>
-          <w:sz w:val="26"/>
-        </w:rPr>
-        <w:t>8. System Implementation Status Matrix</w:t>
+        <w:t>7. Current Implementation Status Matrix</w:t>
       </w:r>
     </w:p>
     <w:p>
@@ -1349,7 +1092,7 @@
                 <w:color w:val="FFFFFF"/>
                 <w:sz w:val="19"/>
               </w:rPr>
-              <w:t>Subsystem / Component</w:t>
+              <w:t>Subsystem</w:t>
             </w:r>
           </w:p>
         </w:tc>
@@ -1376,7 +1119,7 @@
                 <w:color w:val="FFFFFF"/>
                 <w:sz w:val="19"/>
               </w:rPr>
-              <w:t>Technology Stack</w:t>
+              <w:t>Tech Stack</w:t>
             </w:r>
           </w:p>
         </w:tc>
@@ -1403,7 +1146,7 @@
                 <w:color w:val="FFFFFF"/>
                 <w:sz w:val="19"/>
               </w:rPr>
-              <w:t>Key Finished Capabilities</w:t>
+              <w:t>Finished Capabilities</w:t>
             </w:r>
           </w:p>
         </w:tc>
@@ -1430,7 +1173,7 @@
                 <w:color w:val="FFFFFF"/>
                 <w:sz w:val="19"/>
               </w:rPr>
-              <w:t>Deployment Status</w:t>
+              <w:t>Current Status</w:t>
             </w:r>
           </w:p>
         </w:tc>
@@ -1484,7 +1227,7 @@
                 <w:color w:val="1E293B"/>
                 <w:sz w:val="18"/>
               </w:rPr>
-              <w:t>Flutter Web, Riverpod 2, GoRouter</w:t>
+              <w:t>Flutter Web, Riverpod 2</w:t>
             </w:r>
           </w:p>
         </w:tc>
@@ -1510,7 +1253,7 @@
                 <w:color w:val="1E293B"/>
                 <w:sz w:val="18"/>
               </w:rPr>
-              <w:t>Triage dashboard, DR sign-off, LiveKit WebRTC, e-Prescription PDF</w:t>
+              <w:t>Live triage queue, retinal review, LiveKit video, signed PDF prescription</w:t>
             </w:r>
           </w:p>
         </w:tc>
@@ -1536,7 +1279,7 @@
                 <w:color w:val="1E293B"/>
                 <w:sz w:val="18"/>
               </w:rPr>
-              <w:t>100% Live (doctor.thisulink.xyz)</w:t>
+              <w:t>100% Deployed &amp; Live (thisulink.xyz)</w:t>
             </w:r>
           </w:p>
         </w:tc>
@@ -1564,7 +1307,7 @@
                 <w:color w:val="1E293B"/>
                 <w:sz w:val="18"/>
               </w:rPr>
-              <w:t>Health Worker Suite</w:t>
+              <w:t>Health Worker App</w:t>
             </w:r>
           </w:p>
         </w:tc>
@@ -1590,7 +1333,7 @@
                 <w:color w:val="1E293B"/>
                 <w:sz w:val="18"/>
               </w:rPr>
-              <w:t>Flutter (Win/Android), Drift SQLite</w:t>
+              <w:t>Flutter (Win/Android), SQLite</w:t>
             </w:r>
           </w:p>
         </w:tc>
@@ -1616,7 +1359,7 @@
                 <w:color w:val="1E293B"/>
                 <w:sz w:val="18"/>
               </w:rPr>
-              <w:t>Patient registry, 73-byte BLE telemetry, Preload gate, Offline sync</w:t>
+              <w:t>Patient registry, 73-byte BLE telemetry, 1.5N force interlock, offline sync</w:t>
             </w:r>
           </w:p>
         </w:tc>
@@ -1642,7 +1385,7 @@
                 <w:color w:val="1E293B"/>
                 <w:sz w:val="18"/>
               </w:rPr>
-              <w:t>100% Shipped &amp; Tested (63 passing)</w:t>
+              <w:t>100% Tested (63 tests passing)</w:t>
             </w:r>
           </w:p>
         </w:tc>
@@ -1722,7 +1465,7 @@
                 <w:color w:val="1E293B"/>
                 <w:sz w:val="18"/>
               </w:rPr>
-              <w:t>Vitals trends, Live consult lobby, Doctor-gated diet plans</w:t>
+              <w:t>Vitals trends, tele-consult lobby, doctor-approved diet plans</w:t>
             </w:r>
           </w:p>
         </w:tc>
@@ -1748,7 +1491,7 @@
                 <w:color w:val="1E293B"/>
                 <w:sz w:val="18"/>
               </w:rPr>
-              <w:t>100% Verified UI/UX Flow</w:t>
+              <w:t>UI &amp; workflows verified</w:t>
             </w:r>
           </w:p>
         </w:tc>
@@ -1776,7 +1519,7 @@
                 <w:color w:val="1E293B"/>
                 <w:sz w:val="18"/>
               </w:rPr>
-              <w:t>Cloud Backend</w:t>
+              <w:t>Backend Core</w:t>
             </w:r>
           </w:p>
         </w:tc>
@@ -1802,7 +1545,7 @@
                 <w:color w:val="1E293B"/>
                 <w:sz w:val="18"/>
               </w:rPr>
-              <w:t>PocketBase (Go), SQLite WAL</w:t>
+              <w:t>PocketBase, SQLite WAL</w:t>
             </w:r>
           </w:p>
         </w:tc>
@@ -1828,7 +1571,7 @@
                 <w:color w:val="1E293B"/>
                 <w:sz w:val="18"/>
               </w:rPr>
-              <w:t>Zero-Trust RBAC, Server-side triage hook, File vault, Event bus</w:t>
+              <w:t>Role-based security, triage hooks, encrypted file storage</w:t>
             </w:r>
           </w:p>
         </w:tc>
@@ -1882,7 +1625,7 @@
                 <w:color w:val="1E293B"/>
                 <w:sz w:val="18"/>
               </w:rPr>
-              <w:t>AI Care Engine</w:t>
+              <w:t>Edge Retinal AI</w:t>
             </w:r>
           </w:p>
         </w:tc>
@@ -1908,7 +1651,7 @@
                 <w:color w:val="1E293B"/>
                 <w:sz w:val="18"/>
               </w:rPr>
-              <w:t>Groq Llama-3.3-70B API</w:t>
+              <w:t>TFLite INT8, EfficientNet</w:t>
             </w:r>
           </w:p>
         </w:tc>
@@ -1934,7 +1677,7 @@
                 <w:color w:val="1E293B"/>
                 <w:sz w:val="18"/>
               </w:rPr>
-              <w:t>Automated meal generation, Safety scoring, Doctor approval gate</w:t>
+              <w:t>Offline 5-class DR grading, glare detection, &lt;2s inference</w:t>
             </w:r>
           </w:p>
         </w:tc>
@@ -1960,7 +1703,7 @@
                 <w:color w:val="1E293B"/>
                 <w:sz w:val="18"/>
               </w:rPr>
-              <w:t>100% Integrated via server hooks</w:t>
+              <w:t>Integrated &amp; benchmarked</w:t>
             </w:r>
           </w:p>
         </w:tc>
@@ -1988,7 +1731,7 @@
                 <w:color w:val="1E293B"/>
                 <w:sz w:val="18"/>
               </w:rPr>
-              <w:t>Retinal AI Model</w:t>
+              <w:t>Infrastructure</w:t>
             </w:r>
           </w:p>
         </w:tc>
@@ -2014,7 +1757,7 @@
                 <w:color w:val="1E293B"/>
                 <w:sz w:val="18"/>
               </w:rPr>
-              <w:t>TensorFlow Lite INT8, EfficientNet</w:t>
+              <w:t>Cloudflare Tunnels, Tailscale</w:t>
             </w:r>
           </w:p>
         </w:tc>
@@ -2040,7 +1783,7 @@
                 <w:color w:val="1E293B"/>
                 <w:sz w:val="18"/>
               </w:rPr>
-              <w:t>Offline DR grading (ICDR 0-4), Glare gate, &lt;2s inference</w:t>
+              <w:t>Zero exposed ports, automatic TLS encryption, reverse proxy</w:t>
             </w:r>
           </w:p>
         </w:tc>
@@ -2066,113 +1809,7 @@
                 <w:color w:val="1E293B"/>
                 <w:sz w:val="18"/>
               </w:rPr>
-              <w:t>Architecture &amp; pipeline integrated</w:t>
-            </w:r>
-          </w:p>
-        </w:tc>
-      </w:tr>
-      <w:tr>
-        <w:tc>
-          <w:tcPr>
-            <w:tcW w:type="dxa" w:w="2484"/>
-            <w:shd w:fill="FFFFFF"/>
-            <w:tcMar>
-              <w:top w:w="80" w:type="dxa"/>
-              <w:bottom w:w="80" w:type="dxa"/>
-              <w:left w:w="80" w:type="dxa"/>
-              <w:right w:w="80" w:type="dxa"/>
-            </w:tcMar>
-          </w:tcPr>
-          <w:p>
-            <w:pPr>
-              <w:spacing w:before="60" w:after="60"/>
-            </w:pPr>
-            <w:r/>
-            <w:r>
-              <w:rPr>
-                <w:rFonts w:ascii="Arial" w:hAnsi="Arial"/>
-                <w:color w:val="1E293B"/>
-                <w:sz w:val="18"/>
-              </w:rPr>
-              <w:t>Infrastructure</w:t>
-            </w:r>
-          </w:p>
-        </w:tc>
-        <w:tc>
-          <w:tcPr>
-            <w:tcW w:type="dxa" w:w="2484"/>
-            <w:shd w:fill="FFFFFF"/>
-            <w:tcMar>
-              <w:top w:w="80" w:type="dxa"/>
-              <w:bottom w:w="80" w:type="dxa"/>
-              <w:left w:w="80" w:type="dxa"/>
-              <w:right w:w="80" w:type="dxa"/>
-            </w:tcMar>
-          </w:tcPr>
-          <w:p>
-            <w:pPr>
-              <w:spacing w:before="60" w:after="60"/>
-            </w:pPr>
-            <w:r/>
-            <w:r>
-              <w:rPr>
-                <w:rFonts w:ascii="Arial" w:hAnsi="Arial"/>
-                <w:color w:val="1E293B"/>
-                <w:sz w:val="18"/>
-              </w:rPr>
-              <w:t>Ubuntu LTS, Cloudflare, Tailscale</w:t>
-            </w:r>
-          </w:p>
-        </w:tc>
-        <w:tc>
-          <w:tcPr>
-            <w:tcW w:type="dxa" w:w="2484"/>
-            <w:shd w:fill="FFFFFF"/>
-            <w:tcMar>
-              <w:top w:w="80" w:type="dxa"/>
-              <w:bottom w:w="80" w:type="dxa"/>
-              <w:left w:w="80" w:type="dxa"/>
-              <w:right w:w="80" w:type="dxa"/>
-            </w:tcMar>
-          </w:tcPr>
-          <w:p>
-            <w:pPr>
-              <w:spacing w:before="60" w:after="60"/>
-            </w:pPr>
-            <w:r/>
-            <w:r>
-              <w:rPr>
-                <w:rFonts w:ascii="Arial" w:hAnsi="Arial"/>
-                <w:color w:val="1E293B"/>
-                <w:sz w:val="18"/>
-              </w:rPr>
-              <w:t>Zero-port mesh security, Automatic SSL, Edge reverse proxy</w:t>
-            </w:r>
-          </w:p>
-        </w:tc>
-        <w:tc>
-          <w:tcPr>
-            <w:tcW w:type="dxa" w:w="2484"/>
-            <w:shd w:fill="FFFFFF"/>
-            <w:tcMar>
-              <w:top w:w="80" w:type="dxa"/>
-              <w:bottom w:w="80" w:type="dxa"/>
-              <w:left w:w="80" w:type="dxa"/>
-              <w:right w:w="80" w:type="dxa"/>
-            </w:tcMar>
-          </w:tcPr>
-          <w:p>
-            <w:pPr>
-              <w:spacing w:before="60" w:after="60"/>
-            </w:pPr>
-            <w:r/>
-            <w:r>
-              <w:rPr>
-                <w:rFonts w:ascii="Arial" w:hAnsi="Arial"/>
-                <w:color w:val="1E293B"/>
-                <w:sz w:val="18"/>
-              </w:rPr>
-              <w:t>100% Operational &amp; Verified</w:t>
+              <w:t>100% Operational</w:t>
             </w:r>
           </w:p>
         </w:tc>
@@ -2181,16 +1818,16 @@
     <w:p>
       <w:pPr>
         <w:keepNext/>
-        <w:spacing w:before="280" w:after="120"/>
+        <w:spacing w:before="240" w:after="80"/>
       </w:pPr>
       <w:r>
         <w:rPr>
           <w:rFonts w:ascii="Arial" w:hAnsi="Arial"/>
           <w:b/>
           <w:color w:val="183A8E"/>
-          <w:sz w:val="26"/>
+          <w:sz w:val="25"/>
         </w:rPr>
-        <w:t>9. Verified Live Endpoints &amp; Project Resources</w:t>
+        <w:t>8. Live Endpoints &amp; Project Links</w:t>
       </w:r>
     </w:p>
     <w:p>
@@ -2217,7 +1854,7 @@
           <w:color w:val="1E293B"/>
           <w:sz w:val="20"/>
         </w:rPr>
-        <w:t xml:space="preserve">Physician Web Workstation: </w:t>
+        <w:t xml:space="preserve">Doctor Portal (Live): </w:t>
       </w:r>
       <w:r>
         <w:rPr>
@@ -2225,7 +1862,7 @@
           <w:color w:val="1E293B"/>
           <w:sz w:val="20"/>
         </w:rPr>
-        <w:t>https://thisulink.xyz / https://doctor.thisulink.xyz</w:t>
+        <w:t>https://thisulink.xyz</w:t>
       </w:r>
     </w:p>
     <w:p>
@@ -2240,7 +1877,7 @@
           <w:color w:val="1E293B"/>
           <w:sz w:val="20"/>
         </w:rPr>
-        <w:t xml:space="preserve">Cloud Backend Core API: </w:t>
+        <w:t xml:space="preserve">Backend API (Live): </w:t>
       </w:r>
       <w:r>
         <w:rPr>
@@ -2248,7 +1885,7 @@
           <w:color w:val="1E293B"/>
           <w:sz w:val="20"/>
         </w:rPr>
-        <w:t>https://pb.thisulink.xyz/api/health (HTTP 200 OK)</w:t>
+        <w:t>https://pb.thisulink.xyz/api/health</w:t>
       </w:r>
     </w:p>
     <w:p>
@@ -2271,7 +1908,7 @@
           <w:color w:val="1E293B"/>
           <w:sz w:val="20"/>
         </w:rPr>
-        <w:t>https://github.com/thisulink/thisulink (Branch: main, Commit: 390c840)</w:t>
+        <w:t>https://github.com/thisulink/thisulink</w:t>
       </w:r>
     </w:p>
     <w:p>
@@ -2286,7 +1923,7 @@
           <w:color w:val="1E293B"/>
           <w:sz w:val="20"/>
         </w:rPr>
-        <w:t xml:space="preserve">Prototype Verification Gallery: </w:t>
+        <w:t xml:space="preserve">Prototype Screenshot Gallery: </w:t>
       </w:r>
       <w:r>
         <w:rPr>

</xml_diff>